<commit_message>
Sprint 2.2 - Integra AgendaUpdater com TextUpdater
</commit_message>
<xml_diff>
--- a/modelos/teste_text_updater.docx
+++ b/modelos/teste_text_updater.docx
@@ -4,7 +4,31 @@
   <w:body>
     <w:p>
       <w:r>
-        <w:t>teste</w:t>
+        <w:t>TESTE DO TEXTUPDATER</w:t>
+      </w:r>
+    </w:p>
+    <w:p/>
+    <w:p>
+      <w:r>
+        <w:t>Audiência em 05/01/2027.</w:t>
+      </w:r>
+    </w:p>
+    <w:p/>
+    <w:p>
+      <w:r>
+        <w:t>Reunião em 10/02/2027.</w:t>
+      </w:r>
+    </w:p>
+    <w:p/>
+    <w:p>
+      <w:r>
+        <w:t>Prazo processual em 15/03/2027.</w:t>
+      </w:r>
+    </w:p>
+    <w:p/>
+    <w:p>
+      <w:r>
+        <w:t>Este parágrafo não possui nenhuma data.</w:t>
       </w:r>
     </w:p>
     <w:sectPr>

</xml_diff>